<commit_message>
nuevas mejoras del software
</commit_message>
<xml_diff>
--- a/FORMATO A CITACIÓN A DESCARGOS-GENERAL-19 DE DICIEMBRE DE 2025.docx
+++ b/FORMATO A CITACIÓN A DESCARGOS-GENERAL-19 DE DICIEMBRE DE 2025.docx
@@ -1279,7 +1279,18 @@
           <w:szCs w:val="20"/>
           <w:lang w:val="es-MX" w:eastAsia="fr-CA"/>
         </w:rPr>
-        <w:t>Así las cosas, los anteriores hechos implican una posible violación a sus obligaciones contractuales, reglamentarias y legales, que pueden ser constitutivos de una falta disciplinaria de acuerdo con las siguientes normas:</w:t>
+        <w:t>Así las cosas, los anteriores hechos implican una posible violación a sus obligaciones contractuales, reglamentarias y legales, que pueden ser constitutivos de una falta disciplinaria</w:t>
+      </w:r>
+      <w:bookmarkStart w:id="1" w:name="_Hlk86056305"/>
+      <w:r>
+        <w:rPr>
+          <w:rFonts w:ascii="Tahoma" w:eastAsia="Times New Roman" w:hAnsi="Tahoma" w:cs="Tahoma"/>
+          <w:snapToGrid w:val="0"/>
+          <w:sz w:val="20"/>
+          <w:szCs w:val="20"/>
+          <w:lang w:val="es-MX" w:eastAsia="fr-CA"/>
+        </w:rPr>
+        <w:t>.</w:t>
       </w:r>
     </w:p>
     <w:p>
@@ -1296,133 +1307,6 @@
           <w:lang w:val="es-MX" w:eastAsia="fr-CA"/>
         </w:rPr>
       </w:pPr>
-    </w:p>
-    <w:p>
-      <w:pPr>
-        <w:overflowPunct w:val="0"/>
-        <w:autoSpaceDE w:val="0"/>
-        <w:adjustRightInd w:val="0"/>
-        <w:jc w:val="both"/>
-        <w:rPr>
-          <w:rFonts w:ascii="Tahoma" w:eastAsia="Calibri" w:hAnsi="Tahoma" w:cs="Tahoma"/>
-          <w:b/>
-          <w:snapToGrid w:val="0"/>
-          <w:sz w:val="20"/>
-          <w:szCs w:val="20"/>
-          <w:lang w:eastAsia="fr-CA"/>
-        </w:rPr>
-      </w:pPr>
-      <w:r>
-        <w:rPr>
-          <w:rFonts w:ascii="Tahoma" w:eastAsia="Calibri" w:hAnsi="Tahoma" w:cs="Tahoma"/>
-          <w:b/>
-          <w:snapToGrid w:val="0"/>
-          <w:sz w:val="20"/>
-          <w:szCs w:val="20"/>
-          <w:lang w:eastAsia="fr-CA"/>
-        </w:rPr>
-        <w:t>Reglamento de Trabajo.</w:t>
-      </w:r>
-    </w:p>
-    <w:p>
-      <w:pPr>
-        <w:suppressAutoHyphens w:val="0"/>
-        <w:autoSpaceDN/>
-        <w:spacing w:line="0" w:lineRule="atLeast"/>
-        <w:jc w:val="both"/>
-        <w:textAlignment w:val="auto"/>
-        <w:rPr>
-          <w:rFonts w:ascii="Tahoma" w:hAnsi="Tahoma" w:cs="Tahoma"/>
-          <w:sz w:val="20"/>
-          <w:szCs w:val="20"/>
-        </w:rPr>
-      </w:pPr>
-    </w:p>
-    <w:p>
-      <w:pPr>
-        <w:suppressAutoHyphens w:val="0"/>
-        <w:adjustRightInd w:val="0"/>
-        <w:snapToGrid w:val="0"/>
-        <w:spacing w:after="120"/>
-        <w:contextualSpacing/>
-        <w:jc w:val="both"/>
-        <w:textAlignment w:val="auto"/>
-        <w:rPr>
-          <w:rFonts w:ascii="Tahoma" w:hAnsi="Tahoma" w:cs="Tahoma"/>
-          <w:b/>
-          <w:sz w:val="20"/>
-          <w:szCs w:val="20"/>
-          <w:lang w:val="es-MX"/>
-        </w:rPr>
-      </w:pPr>
-      <w:r>
-        <w:rPr>
-          <w:rFonts w:ascii="Tahoma" w:hAnsi="Tahoma" w:cs="Tahoma"/>
-          <w:b/>
-          <w:sz w:val="20"/>
-          <w:szCs w:val="20"/>
-          <w:lang w:val="es-MX"/>
-        </w:rPr>
-        <w:t>Código Sustantivo de Trabajo.</w:t>
-      </w:r>
-    </w:p>
-    <w:p>
-      <w:pPr>
-        <w:suppressAutoHyphens w:val="0"/>
-        <w:adjustRightInd w:val="0"/>
-        <w:snapToGrid w:val="0"/>
-        <w:spacing w:after="120"/>
-        <w:contextualSpacing/>
-        <w:jc w:val="both"/>
-        <w:textAlignment w:val="auto"/>
-        <w:rPr>
-          <w:rFonts w:ascii="Tahoma" w:hAnsi="Tahoma" w:cs="Tahoma"/>
-          <w:b/>
-          <w:sz w:val="20"/>
-          <w:szCs w:val="20"/>
-          <w:lang w:val="es-MX"/>
-        </w:rPr>
-      </w:pPr>
-    </w:p>
-    <w:p>
-      <w:pPr>
-        <w:suppressAutoHyphens w:val="0"/>
-        <w:adjustRightInd w:val="0"/>
-        <w:snapToGrid w:val="0"/>
-        <w:spacing w:after="120"/>
-        <w:contextualSpacing/>
-        <w:textAlignment w:val="auto"/>
-        <w:rPr>
-          <w:rFonts w:ascii="Tahoma" w:hAnsi="Tahoma" w:cs="Tahoma"/>
-          <w:b/>
-          <w:sz w:val="20"/>
-          <w:szCs w:val="20"/>
-          <w:lang w:val="es-MX"/>
-        </w:rPr>
-      </w:pPr>
-      <w:r>
-        <w:rPr>
-          <w:rFonts w:ascii="Tahoma" w:eastAsia="Calibri" w:hAnsi="Tahoma" w:cs="Tahoma"/>
-          <w:bCs/>
-          <w:snapToGrid w:val="0"/>
-          <w:sz w:val="20"/>
-          <w:szCs w:val="20"/>
-          <w:lang w:eastAsia="fr-CA"/>
-        </w:rPr>
-        <w:t>${</w:t>
-      </w:r>
-      <w:r>
-        <w:rPr>
-          <w:rFonts w:ascii="Tahoma" w:eastAsia="Calibri" w:hAnsi="Tahoma" w:cs="Tahoma"/>
-          <w:bCs/>
-          <w:snapToGrid w:val="0"/>
-          <w:sz w:val="20"/>
-          <w:szCs w:val="20"/>
-          <w:lang w:val="es-MX" w:eastAsia="fr-CA"/>
-        </w:rPr>
-        <w:t>ARTICULOS_LEGALES}</w:t>
-      </w:r>
-      <w:bookmarkStart w:id="1" w:name="_Hlk86056305"/>
     </w:p>
     <w:bookmarkEnd w:id="1"/>
     <w:p>

</xml_diff>